<commit_message>
Minor fixes and comments
</commit_message>
<xml_diff>
--- a/Courses/Software-Sciences/IT-Module-3-Web-Design/15-Website-Testing/15-Website-Testing-Exercises.docx
+++ b/Courses/Software-Sciences/IT-Module-3-Web-Design/15-Website-Testing/15-Website-Testing-Exercises.docx
@@ -1,6 +1,6 @@
 
 <file path=word/document.xml><?xml version="1.0" encoding="utf-8"?>
-<w:document xmlns:wpc="http://schemas.microsoft.com/office/word/2010/wordprocessingCanvas" xmlns:cx="http://schemas.microsoft.com/office/drawing/2014/chartex" xmlns:cx1="http://schemas.microsoft.com/office/drawing/2015/9/8/chartex" xmlns:cx2="http://schemas.microsoft.com/office/drawing/2015/10/21/chartex" xmlns:cx3="http://schemas.microsoft.com/office/drawing/2016/5/9/chartex" xmlns:cx4="http://schemas.microsoft.com/office/drawing/2016/5/10/chartex" xmlns:cx5="http://schemas.microsoft.com/office/drawing/2016/5/11/chartex" xmlns:cx6="http://schemas.microsoft.com/office/drawing/2016/5/12/chartex" xmlns:cx7="http://schemas.microsoft.com/office/drawing/2016/5/13/chartex" xmlns:cx8="http://schemas.microsoft.com/office/drawing/2016/5/14/chartex" xmlns:mc="http://schemas.openxmlformats.org/markup-compatibility/2006" xmlns:aink="http://schemas.microsoft.com/office/drawing/2016/ink" xmlns:am3d="http://schemas.microsoft.com/office/drawing/2017/model3d" xmlns:o="urn:schemas-microsoft-com:office:office" xmlns:oel="http://schemas.microsoft.com/office/2019/extlst" xmlns:r="http://schemas.openxmlformats.org/officeDocument/2006/relationships" xmlns:m="http://schemas.openxmlformats.org/officeDocument/2006/math" xmlns:v="urn:schemas-microsoft-com:vml" xmlns:wp14="http://schemas.microsoft.com/office/word/2010/wordprocessingDrawing" xmlns:wp="http://schemas.openxmlformats.org/drawingml/2006/wordprocessingDrawing" xmlns:w10="urn:schemas-microsoft-com:office:word" xmlns:w="http://schemas.openxmlformats.org/wordprocessingml/2006/main" xmlns:w14="http://schemas.microsoft.com/office/word/2010/wordml" xmlns:w15="http://schemas.microsoft.com/office/word/2012/wordml" xmlns:w16cex="http://schemas.microsoft.com/office/word/2018/wordml/cex" xmlns:w16cid="http://schemas.microsoft.com/office/word/2016/wordml/cid" xmlns:w16="http://schemas.microsoft.com/office/word/2018/wordml" xmlns:w16sdtdh="http://schemas.microsoft.com/office/word/2020/wordml/sdtdatahash" xmlns:w16se="http://schemas.microsoft.com/office/word/2015/wordml/symex" xmlns:wpg="http://schemas.microsoft.com/office/word/2010/wordprocessingGroup" xmlns:wpi="http://schemas.microsoft.com/office/word/2010/wordprocessingInk" xmlns:wne="http://schemas.microsoft.com/office/word/2006/wordml" xmlns:wps="http://schemas.microsoft.com/office/word/2010/wordprocessingShape" mc:Ignorable="w14 w15 w16se w16cid w16 w16cex w16sdtdh wp14">
+<w:document xmlns:wpc="http://schemas.microsoft.com/office/word/2010/wordprocessingCanvas" xmlns:cx="http://schemas.microsoft.com/office/drawing/2014/chartex" xmlns:cx1="http://schemas.microsoft.com/office/drawing/2015/9/8/chartex" xmlns:cx2="http://schemas.microsoft.com/office/drawing/2015/10/21/chartex" xmlns:cx3="http://schemas.microsoft.com/office/drawing/2016/5/9/chartex" xmlns:cx4="http://schemas.microsoft.com/office/drawing/2016/5/10/chartex" xmlns:cx5="http://schemas.microsoft.com/office/drawing/2016/5/11/chartex" xmlns:cx6="http://schemas.microsoft.com/office/drawing/2016/5/12/chartex" xmlns:cx7="http://schemas.microsoft.com/office/drawing/2016/5/13/chartex" xmlns:cx8="http://schemas.microsoft.com/office/drawing/2016/5/14/chartex" xmlns:mc="http://schemas.openxmlformats.org/markup-compatibility/2006" xmlns:aink="http://schemas.microsoft.com/office/drawing/2016/ink" xmlns:am3d="http://schemas.microsoft.com/office/drawing/2017/model3d" xmlns:o="urn:schemas-microsoft-com:office:office" xmlns:oel="http://schemas.microsoft.com/office/2019/extlst" xmlns:r="http://schemas.openxmlformats.org/officeDocument/2006/relationships" xmlns:m="http://schemas.openxmlformats.org/officeDocument/2006/math" xmlns:v="urn:schemas-microsoft-com:vml" xmlns:wp14="http://schemas.microsoft.com/office/word/2010/wordprocessingDrawing" xmlns:wp="http://schemas.openxmlformats.org/drawingml/2006/wordprocessingDrawing" xmlns:w10="urn:schemas-microsoft-com:office:word" xmlns:w="http://schemas.openxmlformats.org/wordprocessingml/2006/main" xmlns:w14="http://schemas.microsoft.com/office/word/2010/wordml" xmlns:w15="http://schemas.microsoft.com/office/word/2012/wordml" xmlns:w16cex="http://schemas.microsoft.com/office/word/2018/wordml/cex" xmlns:w16cid="http://schemas.microsoft.com/office/word/2016/wordml/cid" xmlns:w16="http://schemas.microsoft.com/office/word/2018/wordml" xmlns:w16du="http://schemas.microsoft.com/office/word/2023/wordml/word16du" xmlns:w16sdtdh="http://schemas.microsoft.com/office/word/2020/wordml/sdtdatahash" xmlns:w16se="http://schemas.microsoft.com/office/word/2015/wordml/symex" xmlns:wpg="http://schemas.microsoft.com/office/word/2010/wordprocessingGroup" xmlns:wpi="http://schemas.microsoft.com/office/word/2010/wordprocessingInk" xmlns:wne="http://schemas.microsoft.com/office/word/2006/wordml" xmlns:wps="http://schemas.microsoft.com/office/word/2010/wordprocessingShape" mc:Ignorable="w14 w15 w16se w16cid w16 w16cex w16sdtdh w16du wp14">
   <w:body>
     <w:p>
       <w:pPr>
@@ -87,7 +87,7 @@
           <w:noProof/>
         </w:rPr>
         <w:drawing>
-          <wp:inline distT="0" distB="0" distL="0" distR="0" wp14:anchorId="73F5C6D6" wp14:editId="6339D42E">
+          <wp:inline distT="0" distB="0" distL="0" distR="0" wp14:anchorId="73F5C6D6" wp14:editId="12FEBB09">
             <wp:extent cx="1065886" cy="497260"/>
             <wp:effectExtent l="0" t="0" r="1270" b="0"/>
             <wp:docPr id="470543985" name="Picture 1"/>
@@ -245,20 +245,34 @@
         <w:rPr>
           <w:rFonts w:ascii="Calibri" w:hAnsi="Calibri" w:cs="Calibri"/>
         </w:rPr>
-        <w:t xml:space="preserve">HTML </w:t>
+        <w:t>HTML</w:t>
       </w:r>
       <w:r>
         <w:rPr>
           <w:rFonts w:ascii="Calibri" w:hAnsi="Calibri" w:cs="Calibri"/>
           <w:lang w:val="bg-BG"/>
         </w:rPr>
+        <w:t xml:space="preserve"> </w:t>
+      </w:r>
+      <w:r>
+        <w:rPr>
+          <w:rFonts w:ascii="Calibri" w:hAnsi="Calibri" w:cs="Calibri"/>
+          <w:lang w:val="bg-BG"/>
+        </w:rPr>
         <w:t xml:space="preserve">и </w:t>
       </w:r>
       <w:r>
         <w:rPr>
           <w:rFonts w:ascii="Calibri" w:hAnsi="Calibri" w:cs="Calibri"/>
         </w:rPr>
-        <w:t xml:space="preserve">CSS </w:t>
+        <w:t>CSS</w:t>
+      </w:r>
+      <w:r>
+        <w:rPr>
+          <w:rFonts w:ascii="Calibri" w:hAnsi="Calibri" w:cs="Calibri"/>
+          <w:lang w:val="bg-BG"/>
+        </w:rPr>
+        <w:t xml:space="preserve"> </w:t>
       </w:r>
       <w:r>
         <w:rPr>
@@ -376,6 +390,9 @@
         <w:t>уеб страницата</w:t>
       </w:r>
       <w:r>
+        <w:rPr>
+          <w:lang w:val="bg-BG"/>
+        </w:rPr>
         <w:t>?</w:t>
       </w:r>
     </w:p>
@@ -519,6 +536,7 @@
           <w:rFonts w:ascii="Calibri" w:hAnsi="Calibri" w:cs="Calibri"/>
           <w:b/>
           <w:bCs/>
+          <w:lang w:val="bg-BG"/>
         </w:rPr>
         <w:t>"</w:t>
       </w:r>
@@ -534,6 +552,7 @@
           <w:rFonts w:ascii="Calibri" w:hAnsi="Calibri" w:cs="Calibri"/>
           <w:b/>
           <w:bCs/>
+          <w:lang w:val="bg-BG"/>
         </w:rPr>
         <w:t>"</w:t>
       </w:r>
@@ -561,20 +580,34 @@
         <w:rPr>
           <w:rFonts w:ascii="Calibri" w:hAnsi="Calibri" w:cs="Calibri"/>
         </w:rPr>
-        <w:t xml:space="preserve">HTML </w:t>
+        <w:t>HTML</w:t>
       </w:r>
       <w:r>
         <w:rPr>
           <w:rFonts w:ascii="Calibri" w:hAnsi="Calibri" w:cs="Calibri"/>
           <w:lang w:val="bg-BG"/>
         </w:rPr>
+        <w:t xml:space="preserve"> </w:t>
+      </w:r>
+      <w:r>
+        <w:rPr>
+          <w:rFonts w:ascii="Calibri" w:hAnsi="Calibri" w:cs="Calibri"/>
+          <w:lang w:val="bg-BG"/>
+        </w:rPr>
         <w:t xml:space="preserve">файлът е записан с разширение </w:t>
       </w:r>
       <w:r>
         <w:rPr>
           <w:rFonts w:ascii="Calibri" w:hAnsi="Calibri" w:cs="Calibri"/>
-        </w:rPr>
-        <w:t>.html</w:t>
+          <w:lang w:val="bg-BG"/>
+        </w:rPr>
+        <w:t>.</w:t>
+      </w:r>
+      <w:r>
+        <w:rPr>
+          <w:rFonts w:ascii="Calibri" w:hAnsi="Calibri" w:cs="Calibri"/>
+        </w:rPr>
+        <w:t>html</w:t>
       </w:r>
     </w:p>
     <w:p>
@@ -802,7 +835,7 @@
         </w:numPr>
         <w:spacing w:after="0"/>
         <w:rPr>
-          <w:lang w:val="en-BG"/>
+          <w:lang/>
         </w:rPr>
       </w:pPr>
       <w:r>
@@ -870,7 +903,15 @@
           <w:b/>
           <w:bCs/>
         </w:rPr>
-        <w:t xml:space="preserve">HTML </w:t>
+        <w:t>HTML</w:t>
+      </w:r>
+      <w:r>
+        <w:rPr>
+          <w:b/>
+          <w:bCs/>
+          <w:lang w:val="bg-BG"/>
+        </w:rPr>
+        <w:t xml:space="preserve"> </w:t>
       </w:r>
       <w:r>
         <w:rPr>
@@ -884,7 +925,33 @@
         <w:rPr>
           <w:lang w:val="bg-BG"/>
         </w:rPr>
-        <w:t xml:space="preserve"> и кликнете върху </w:t>
+        <w:t xml:space="preserve"> </w:t>
+      </w:r>
+      <w:r>
+        <w:rPr>
+          <w:lang w:val="bg-BG"/>
+        </w:rPr>
+        <w:t xml:space="preserve">от </w:t>
+      </w:r>
+      <w:r>
+        <w:rPr>
+          <w:b/>
+          <w:bCs/>
+          <w:lang w:val="bg-BG"/>
+        </w:rPr>
+        <w:t>практическия проект</w:t>
+      </w:r>
+      <w:r>
+        <w:rPr>
+          <w:lang w:val="bg-BG"/>
+        </w:rPr>
+        <w:t xml:space="preserve"> </w:t>
+      </w:r>
+      <w:r>
+        <w:rPr>
+          <w:lang w:val="bg-BG"/>
+        </w:rPr>
+        <w:t xml:space="preserve">и кликнете върху </w:t>
       </w:r>
       <w:r>
         <w:rPr>
@@ -899,9 +966,20 @@
           <w:b/>
           <w:bCs/>
         </w:rPr>
-        <w:t>Check]</w:t>
-      </w:r>
-      <w:r>
+        <w:t>Check</w:t>
+      </w:r>
+      <w:r>
+        <w:rPr>
+          <w:b/>
+          <w:bCs/>
+          <w:lang w:val="bg-BG"/>
+        </w:rPr>
+        <w:t>]</w:t>
+      </w:r>
+      <w:r>
+        <w:rPr>
+          <w:lang w:val="bg-BG"/>
+        </w:rPr>
         <w:t>.</w:t>
       </w:r>
     </w:p>
@@ -909,7 +987,7 @@
       <w:pPr>
         <w:spacing w:after="0"/>
         <w:rPr>
-          <w:lang w:val="en-BG"/>
+          <w:lang/>
         </w:rPr>
       </w:pPr>
       <w:r>
@@ -917,7 +995,7 @@
           <w:noProof/>
         </w:rPr>
         <w:drawing>
-          <wp:inline distT="0" distB="0" distL="0" distR="0" wp14:anchorId="6ECB8DAF" wp14:editId="594FBE06">
+          <wp:inline distT="0" distB="0" distL="0" distR="0" wp14:anchorId="6ECB8DAF" wp14:editId="30BB0D6C">
             <wp:extent cx="3999634" cy="2537554"/>
             <wp:effectExtent l="12700" t="12700" r="13970" b="15240"/>
             <wp:docPr id="10" name="Picture 9">
@@ -1042,6 +1120,9 @@
         <w:t xml:space="preserve"> в</w:t>
       </w:r>
       <w:r>
+        <w:rPr>
+          <w:lang/>
+        </w:rPr>
         <w:t xml:space="preserve"> </w:t>
       </w:r>
       <w:r>
@@ -1092,7 +1173,15 @@
           <w:bCs/>
           <w:lang w:val="bg-BG"/>
         </w:rPr>
-        <w:t>не показва грешки</w:t>
+        <w:t>спре да</w:t>
+      </w:r>
+      <w:r>
+        <w:rPr>
+          <w:b/>
+          <w:bCs/>
+          <w:lang w:val="bg-BG"/>
+        </w:rPr>
+        <w:t xml:space="preserve"> показва грешки</w:t>
       </w:r>
       <w:r>
         <w:rPr>
@@ -1105,7 +1194,7 @@
       <w:pPr>
         <w:spacing w:after="0"/>
         <w:rPr>
-          <w:lang w:val="en-BG"/>
+          <w:lang/>
         </w:rPr>
       </w:pPr>
       <w:r>
@@ -1113,7 +1202,7 @@
           <w:noProof/>
         </w:rPr>
         <w:drawing>
-          <wp:inline distT="0" distB="0" distL="0" distR="0" wp14:anchorId="600B709D" wp14:editId="0E226A2B">
+          <wp:inline distT="0" distB="0" distL="0" distR="0" wp14:anchorId="600B709D" wp14:editId="56A91C99">
             <wp:extent cx="3903274" cy="2176826"/>
             <wp:effectExtent l="12700" t="12700" r="8890" b="7620"/>
             <wp:docPr id="7" name="Picture 6">
@@ -1203,7 +1292,7 @@
         </w:numPr>
         <w:spacing w:after="0"/>
         <w:rPr>
-          <w:lang w:val="en-BG"/>
+          <w:lang/>
         </w:rPr>
       </w:pPr>
       <w:r>
@@ -1287,7 +1376,15 @@
           <w:b/>
           <w:bCs/>
         </w:rPr>
-        <w:t xml:space="preserve">CSS </w:t>
+        <w:t>CSS</w:t>
+      </w:r>
+      <w:r>
+        <w:rPr>
+          <w:b/>
+          <w:bCs/>
+          <w:lang w:val="bg-BG"/>
+        </w:rPr>
+        <w:t xml:space="preserve"> </w:t>
       </w:r>
       <w:r>
         <w:rPr>
@@ -1301,6 +1398,34 @@
         <w:rPr>
           <w:lang w:val="bg-BG"/>
         </w:rPr>
+        <w:t>от</w:t>
+      </w:r>
+      <w:r>
+        <w:rPr>
+          <w:b/>
+          <w:bCs/>
+          <w:lang w:val="bg-BG"/>
+        </w:rPr>
+        <w:t xml:space="preserve"> </w:t>
+      </w:r>
+      <w:r>
+        <w:rPr>
+          <w:b/>
+          <w:bCs/>
+          <w:lang w:val="bg-BG"/>
+        </w:rPr>
+        <w:t>практическия проект</w:t>
+      </w:r>
+      <w:r>
+        <w:rPr>
+          <w:lang w:val="bg-BG"/>
+        </w:rPr>
+        <w:t xml:space="preserve"> </w:t>
+      </w:r>
+      <w:r>
+        <w:rPr>
+          <w:lang w:val="bg-BG"/>
+        </w:rPr>
         <w:t>и кликнете върху</w:t>
       </w:r>
       <w:r>
@@ -1315,10 +1440,29 @@
         <w:rPr>
           <w:b/>
           <w:bCs/>
-        </w:rPr>
-        <w:t>[Check]</w:t>
-      </w:r>
-      <w:r>
+          <w:lang w:val="bg-BG"/>
+        </w:rPr>
+        <w:t>[</w:t>
+      </w:r>
+      <w:r>
+        <w:rPr>
+          <w:b/>
+          <w:bCs/>
+        </w:rPr>
+        <w:t>Check</w:t>
+      </w:r>
+      <w:r>
+        <w:rPr>
+          <w:b/>
+          <w:bCs/>
+          <w:lang w:val="bg-BG"/>
+        </w:rPr>
+        <w:t>]</w:t>
+      </w:r>
+      <w:r>
+        <w:rPr>
+          <w:lang w:val="bg-BG"/>
+        </w:rPr>
         <w:t>.</w:t>
       </w:r>
     </w:p>
@@ -1328,7 +1472,7 @@
           <w:noProof/>
         </w:rPr>
         <w:drawing>
-          <wp:inline distT="0" distB="0" distL="0" distR="0" wp14:anchorId="320B5575" wp14:editId="042B59D8">
+          <wp:inline distT="0" distB="0" distL="0" distR="0" wp14:anchorId="320B5575" wp14:editId="27648759">
             <wp:extent cx="3967993" cy="2870568"/>
             <wp:effectExtent l="12700" t="12700" r="7620" b="12700"/>
             <wp:docPr id="40662450" name="Picture 1"/>
@@ -1488,7 +1632,15 @@
           <w:bCs/>
           <w:lang w:val="bg-BG"/>
         </w:rPr>
-        <w:t>не показва грешки</w:t>
+        <w:t>спре да</w:t>
+      </w:r>
+      <w:r>
+        <w:rPr>
+          <w:b/>
+          <w:bCs/>
+          <w:lang w:val="bg-BG"/>
+        </w:rPr>
+        <w:t xml:space="preserve"> показва грешки</w:t>
       </w:r>
       <w:r>
         <w:rPr>
@@ -1510,7 +1662,7 @@
           <w:lang w:val="bg-BG"/>
         </w:rPr>
         <w:drawing>
-          <wp:inline distT="0" distB="0" distL="0" distR="0" wp14:anchorId="66916198" wp14:editId="4F978DE5">
+          <wp:inline distT="0" distB="0" distL="0" distR="0" wp14:anchorId="66916198" wp14:editId="13F7E04C">
             <wp:extent cx="4053627" cy="469265"/>
             <wp:effectExtent l="12700" t="12700" r="10795" b="13335"/>
             <wp:docPr id="773837492" name="Picture 2"/>
@@ -1661,6 +1813,7 @@
         <w:rPr>
           <w:noProof/>
         </w:rPr>
+        <w:lastRenderedPageBreak/>
         <w:drawing>
           <wp:inline distT="0" distB="0" distL="0" distR="0" wp14:anchorId="3F0F0AAF" wp14:editId="599258A8">
             <wp:extent cx="3786505" cy="1111281"/>
@@ -1724,7 +1877,6 @@
         <w:rPr>
           <w:lang w:val="bg-BG"/>
         </w:rPr>
-        <w:lastRenderedPageBreak/>
         <w:t xml:space="preserve">Проверете </w:t>
       </w:r>
       <w:r>
@@ -1760,7 +1912,15 @@
           <w:b/>
           <w:bCs/>
         </w:rPr>
-        <w:t xml:space="preserve">HTML </w:t>
+        <w:t>HTML</w:t>
+      </w:r>
+      <w:r>
+        <w:rPr>
+          <w:b/>
+          <w:bCs/>
+          <w:lang w:val="bg-BG"/>
+        </w:rPr>
+        <w:t xml:space="preserve"> </w:t>
       </w:r>
       <w:r>
         <w:rPr>
@@ -1985,13 +2145,31 @@
           <w:b/>
           <w:bCs/>
         </w:rPr>
-        <w:t>Developer Tools</w:t>
-      </w:r>
-      <w:r>
+        <w:t>Developer</w:t>
+      </w:r>
+      <w:r>
+        <w:rPr>
+          <w:b/>
+          <w:bCs/>
+          <w:lang w:val="bg-BG"/>
+        </w:rPr>
         <w:t xml:space="preserve"> </w:t>
       </w:r>
       <w:r>
         <w:rPr>
+          <w:b/>
+          <w:bCs/>
+        </w:rPr>
+        <w:t>Tools</w:t>
+      </w:r>
+      <w:r>
+        <w:rPr>
+          <w:lang w:val="bg-BG"/>
+        </w:rPr>
+        <w:t xml:space="preserve"> </w:t>
+      </w:r>
+      <w:r>
+        <w:rPr>
           <w:lang w:val="bg-BG"/>
         </w:rPr>
         <w:t xml:space="preserve">и включете </w:t>
@@ -2116,6 +2294,9 @@
         <w:t>Styles</w:t>
       </w:r>
       <w:r>
+        <w:rPr>
+          <w:lang w:val="bg-BG"/>
+        </w:rPr>
         <w:t xml:space="preserve"> </w:t>
       </w:r>
       <w:r>
@@ -2143,7 +2324,15 @@
           <w:b/>
           <w:bCs/>
         </w:rPr>
-        <w:t xml:space="preserve">CSS </w:t>
+        <w:t>CSS</w:t>
+      </w:r>
+      <w:r>
+        <w:rPr>
+          <w:b/>
+          <w:bCs/>
+          <w:lang w:val="bg-BG"/>
+        </w:rPr>
+        <w:t xml:space="preserve"> </w:t>
       </w:r>
       <w:r>
         <w:rPr>
@@ -2364,7 +2553,15 @@
           <w:b/>
           <w:bCs/>
         </w:rPr>
-        <w:t xml:space="preserve">alt </w:t>
+        <w:t>alt</w:t>
+      </w:r>
+      <w:r>
+        <w:rPr>
+          <w:b/>
+          <w:bCs/>
+          <w:lang w:val="bg-BG"/>
+        </w:rPr>
+        <w:t xml:space="preserve"> </w:t>
       </w:r>
       <w:r>
         <w:rPr>
@@ -2527,8 +2724,9 @@
           <w:noProof/>
           <w:lang w:val="bg-BG"/>
         </w:rPr>
+        <w:lastRenderedPageBreak/>
         <w:drawing>
-          <wp:inline distT="0" distB="0" distL="0" distR="0" wp14:anchorId="3AA82A83" wp14:editId="10A0DF2A">
+          <wp:inline distT="0" distB="0" distL="0" distR="0" wp14:anchorId="3AA82A83" wp14:editId="2CDC2157">
             <wp:extent cx="3787140" cy="187996"/>
             <wp:effectExtent l="12700" t="12700" r="10160" b="15240"/>
             <wp:docPr id="428412907" name="Picture 4"/>
@@ -2590,7 +2788,7 @@
 </file>
 
 <file path=word/endnotes.xml><?xml version="1.0" encoding="utf-8"?>
-<w:endnotes xmlns:wpc="http://schemas.microsoft.com/office/word/2010/wordprocessingCanvas" xmlns:cx="http://schemas.microsoft.com/office/drawing/2014/chartex" xmlns:cx1="http://schemas.microsoft.com/office/drawing/2015/9/8/chartex" xmlns:cx2="http://schemas.microsoft.com/office/drawing/2015/10/21/chartex" xmlns:cx3="http://schemas.microsoft.com/office/drawing/2016/5/9/chartex" xmlns:cx4="http://schemas.microsoft.com/office/drawing/2016/5/10/chartex" xmlns:cx5="http://schemas.microsoft.com/office/drawing/2016/5/11/chartex" xmlns:cx6="http://schemas.microsoft.com/office/drawing/2016/5/12/chartex" xmlns:cx7="http://schemas.microsoft.com/office/drawing/2016/5/13/chartex" xmlns:cx8="http://schemas.microsoft.com/office/drawing/2016/5/14/chartex" xmlns:mc="http://schemas.openxmlformats.org/markup-compatibility/2006" xmlns:aink="http://schemas.microsoft.com/office/drawing/2016/ink" xmlns:am3d="http://schemas.microsoft.com/office/drawing/2017/model3d" xmlns:o="urn:schemas-microsoft-com:office:office" xmlns:oel="http://schemas.microsoft.com/office/2019/extlst" xmlns:r="http://schemas.openxmlformats.org/officeDocument/2006/relationships" xmlns:m="http://schemas.openxmlformats.org/officeDocument/2006/math" xmlns:v="urn:schemas-microsoft-com:vml" xmlns:wp14="http://schemas.microsoft.com/office/word/2010/wordprocessingDrawing" xmlns:wp="http://schemas.openxmlformats.org/drawingml/2006/wordprocessingDrawing" xmlns:w10="urn:schemas-microsoft-com:office:word" xmlns:w="http://schemas.openxmlformats.org/wordprocessingml/2006/main" xmlns:w14="http://schemas.microsoft.com/office/word/2010/wordml" xmlns:w15="http://schemas.microsoft.com/office/word/2012/wordml" xmlns:w16cex="http://schemas.microsoft.com/office/word/2018/wordml/cex" xmlns:w16cid="http://schemas.microsoft.com/office/word/2016/wordml/cid" xmlns:w16="http://schemas.microsoft.com/office/word/2018/wordml" xmlns:w16sdtdh="http://schemas.microsoft.com/office/word/2020/wordml/sdtdatahash" xmlns:w16se="http://schemas.microsoft.com/office/word/2015/wordml/symex" xmlns:wpg="http://schemas.microsoft.com/office/word/2010/wordprocessingGroup" xmlns:wpi="http://schemas.microsoft.com/office/word/2010/wordprocessingInk" xmlns:wne="http://schemas.microsoft.com/office/word/2006/wordml" xmlns:wps="http://schemas.microsoft.com/office/word/2010/wordprocessingShape" mc:Ignorable="w14 w15 w16se w16cid w16 w16cex w16sdtdh wp14">
+<w:endnotes xmlns:wpc="http://schemas.microsoft.com/office/word/2010/wordprocessingCanvas" xmlns:cx="http://schemas.microsoft.com/office/drawing/2014/chartex" xmlns:cx1="http://schemas.microsoft.com/office/drawing/2015/9/8/chartex" xmlns:cx2="http://schemas.microsoft.com/office/drawing/2015/10/21/chartex" xmlns:cx3="http://schemas.microsoft.com/office/drawing/2016/5/9/chartex" xmlns:cx4="http://schemas.microsoft.com/office/drawing/2016/5/10/chartex" xmlns:cx5="http://schemas.microsoft.com/office/drawing/2016/5/11/chartex" xmlns:cx6="http://schemas.microsoft.com/office/drawing/2016/5/12/chartex" xmlns:cx7="http://schemas.microsoft.com/office/drawing/2016/5/13/chartex" xmlns:cx8="http://schemas.microsoft.com/office/drawing/2016/5/14/chartex" xmlns:mc="http://schemas.openxmlformats.org/markup-compatibility/2006" xmlns:aink="http://schemas.microsoft.com/office/drawing/2016/ink" xmlns:am3d="http://schemas.microsoft.com/office/drawing/2017/model3d" xmlns:o="urn:schemas-microsoft-com:office:office" xmlns:oel="http://schemas.microsoft.com/office/2019/extlst" xmlns:r="http://schemas.openxmlformats.org/officeDocument/2006/relationships" xmlns:m="http://schemas.openxmlformats.org/officeDocument/2006/math" xmlns:v="urn:schemas-microsoft-com:vml" xmlns:wp14="http://schemas.microsoft.com/office/word/2010/wordprocessingDrawing" xmlns:wp="http://schemas.openxmlformats.org/drawingml/2006/wordprocessingDrawing" xmlns:w10="urn:schemas-microsoft-com:office:word" xmlns:w="http://schemas.openxmlformats.org/wordprocessingml/2006/main" xmlns:w14="http://schemas.microsoft.com/office/word/2010/wordml" xmlns:w15="http://schemas.microsoft.com/office/word/2012/wordml" xmlns:w16cex="http://schemas.microsoft.com/office/word/2018/wordml/cex" xmlns:w16cid="http://schemas.microsoft.com/office/word/2016/wordml/cid" xmlns:w16="http://schemas.microsoft.com/office/word/2018/wordml" xmlns:w16du="http://schemas.microsoft.com/office/word/2023/wordml/word16du" xmlns:w16sdtdh="http://schemas.microsoft.com/office/word/2020/wordml/sdtdatahash" xmlns:w16se="http://schemas.microsoft.com/office/word/2015/wordml/symex" xmlns:wpg="http://schemas.microsoft.com/office/word/2010/wordprocessingGroup" xmlns:wpi="http://schemas.microsoft.com/office/word/2010/wordprocessingInk" xmlns:wne="http://schemas.microsoft.com/office/word/2006/wordml" xmlns:wps="http://schemas.microsoft.com/office/word/2010/wordprocessingShape" mc:Ignorable="w14 w15 w16se w16cid w16 w16cex w16sdtdh w16du wp14">
   <w:endnote w:type="separator" w:id="-1">
     <w:p>
       <w:pPr>
@@ -2615,7 +2813,7 @@
 </file>
 
 <file path=word/footer1.xml><?xml version="1.0" encoding="utf-8"?>
-<w:ftr xmlns:wpc="http://schemas.microsoft.com/office/word/2010/wordprocessingCanvas" xmlns:cx="http://schemas.microsoft.com/office/drawing/2014/chartex" xmlns:cx1="http://schemas.microsoft.com/office/drawing/2015/9/8/chartex" xmlns:cx2="http://schemas.microsoft.com/office/drawing/2015/10/21/chartex" xmlns:cx3="http://schemas.microsoft.com/office/drawing/2016/5/9/chartex" xmlns:cx4="http://schemas.microsoft.com/office/drawing/2016/5/10/chartex" xmlns:cx5="http://schemas.microsoft.com/office/drawing/2016/5/11/chartex" xmlns:cx6="http://schemas.microsoft.com/office/drawing/2016/5/12/chartex" xmlns:cx7="http://schemas.microsoft.com/office/drawing/2016/5/13/chartex" xmlns:cx8="http://schemas.microsoft.com/office/drawing/2016/5/14/chartex" xmlns:mc="http://schemas.openxmlformats.org/markup-compatibility/2006" xmlns:aink="http://schemas.microsoft.com/office/drawing/2016/ink" xmlns:am3d="http://schemas.microsoft.com/office/drawing/2017/model3d" xmlns:o="urn:schemas-microsoft-com:office:office" xmlns:oel="http://schemas.microsoft.com/office/2019/extlst" xmlns:r="http://schemas.openxmlformats.org/officeDocument/2006/relationships" xmlns:m="http://schemas.openxmlformats.org/officeDocument/2006/math" xmlns:v="urn:schemas-microsoft-com:vml" xmlns:wp14="http://schemas.microsoft.com/office/word/2010/wordprocessingDrawing" xmlns:wp="http://schemas.openxmlformats.org/drawingml/2006/wordprocessingDrawing" xmlns:w10="urn:schemas-microsoft-com:office:word" xmlns:w="http://schemas.openxmlformats.org/wordprocessingml/2006/main" xmlns:w14="http://schemas.microsoft.com/office/word/2010/wordml" xmlns:w15="http://schemas.microsoft.com/office/word/2012/wordml" xmlns:w16cex="http://schemas.microsoft.com/office/word/2018/wordml/cex" xmlns:w16cid="http://schemas.microsoft.com/office/word/2016/wordml/cid" xmlns:w16="http://schemas.microsoft.com/office/word/2018/wordml" xmlns:w16sdtdh="http://schemas.microsoft.com/office/word/2020/wordml/sdtdatahash" xmlns:w16se="http://schemas.microsoft.com/office/word/2015/wordml/symex" xmlns:wpg="http://schemas.microsoft.com/office/word/2010/wordprocessingGroup" xmlns:wpi="http://schemas.microsoft.com/office/word/2010/wordprocessingInk" xmlns:wne="http://schemas.microsoft.com/office/word/2006/wordml" xmlns:wps="http://schemas.microsoft.com/office/word/2010/wordprocessingShape" mc:Ignorable="w14 w15 w16se w16cid w16 w16cex w16sdtdh wp14">
+<w:ftr xmlns:wpc="http://schemas.microsoft.com/office/word/2010/wordprocessingCanvas" xmlns:cx="http://schemas.microsoft.com/office/drawing/2014/chartex" xmlns:cx1="http://schemas.microsoft.com/office/drawing/2015/9/8/chartex" xmlns:cx2="http://schemas.microsoft.com/office/drawing/2015/10/21/chartex" xmlns:cx3="http://schemas.microsoft.com/office/drawing/2016/5/9/chartex" xmlns:cx4="http://schemas.microsoft.com/office/drawing/2016/5/10/chartex" xmlns:cx5="http://schemas.microsoft.com/office/drawing/2016/5/11/chartex" xmlns:cx6="http://schemas.microsoft.com/office/drawing/2016/5/12/chartex" xmlns:cx7="http://schemas.microsoft.com/office/drawing/2016/5/13/chartex" xmlns:cx8="http://schemas.microsoft.com/office/drawing/2016/5/14/chartex" xmlns:mc="http://schemas.openxmlformats.org/markup-compatibility/2006" xmlns:aink="http://schemas.microsoft.com/office/drawing/2016/ink" xmlns:am3d="http://schemas.microsoft.com/office/drawing/2017/model3d" xmlns:o="urn:schemas-microsoft-com:office:office" xmlns:oel="http://schemas.microsoft.com/office/2019/extlst" xmlns:r="http://schemas.openxmlformats.org/officeDocument/2006/relationships" xmlns:m="http://schemas.openxmlformats.org/officeDocument/2006/math" xmlns:v="urn:schemas-microsoft-com:vml" xmlns:wp14="http://schemas.microsoft.com/office/word/2010/wordprocessingDrawing" xmlns:wp="http://schemas.openxmlformats.org/drawingml/2006/wordprocessingDrawing" xmlns:w10="urn:schemas-microsoft-com:office:word" xmlns:w="http://schemas.openxmlformats.org/wordprocessingml/2006/main" xmlns:w14="http://schemas.microsoft.com/office/word/2010/wordml" xmlns:w15="http://schemas.microsoft.com/office/word/2012/wordml" xmlns:w16cex="http://schemas.microsoft.com/office/word/2018/wordml/cex" xmlns:w16cid="http://schemas.microsoft.com/office/word/2016/wordml/cid" xmlns:w16="http://schemas.microsoft.com/office/word/2018/wordml" xmlns:w16du="http://schemas.microsoft.com/office/word/2023/wordml/word16du" xmlns:w16sdtdh="http://schemas.microsoft.com/office/word/2020/wordml/sdtdatahash" xmlns:w16se="http://schemas.microsoft.com/office/word/2015/wordml/symex" xmlns:wpg="http://schemas.microsoft.com/office/word/2010/wordprocessingGroup" xmlns:wpi="http://schemas.microsoft.com/office/word/2010/wordprocessingInk" xmlns:wne="http://schemas.microsoft.com/office/word/2006/wordml" xmlns:wps="http://schemas.microsoft.com/office/word/2010/wordprocessingShape" mc:Ignorable="w14 w15 w16se w16cid w16 w16cex w16sdtdh w16du wp14">
   <w:p>
     <w:pPr>
       <w:pStyle w:val="Footer"/>
@@ -2963,7 +3161,7 @@
               <v:stroke joinstyle="miter"/>
               <v:path gradientshapeok="t" o:connecttype="rect"/>
             </v:shapetype>
-            <v:shape id="Text Box 16" o:spid="_x0000_s1026" type="#_x0000_t202" style="position:absolute;margin-left:101.15pt;margin-top:6.95pt;width:418.95pt;height:40.45pt;z-index:251660288;visibility:visible;mso-wrap-style:square;mso-width-percent:0;mso-height-percent:0;mso-wrap-distance-left:9pt;mso-wrap-distance-top:0;mso-wrap-distance-right:9pt;mso-wrap-distance-bottom:0;mso-position-horizontal:absolute;mso-position-horizontal-relative:text;mso-position-vertical:absolute;mso-position-vertical-relative:text;mso-width-percent:0;mso-height-percent:0;mso-width-relative:page;mso-height-relative:page;v-text-anchor:top" o:gfxdata="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" filled="f" stroked="f">
+            <v:shape id="Text Box 16" o:spid="_x0000_s1026" type="#_x0000_t202" style="position:absolute;margin-left:101.15pt;margin-top:6.95pt;width:418.95pt;height:40.45pt;z-index:251660288;visibility:visible;mso-wrap-style:square;mso-width-percent:0;mso-height-percent:0;mso-wrap-distance-left:9pt;mso-wrap-distance-top:0;mso-wrap-distance-right:9pt;mso-wrap-distance-bottom:0;mso-position-horizontal:absolute;mso-position-horizontal-relative:text;mso-position-vertical:absolute;mso-position-vertical-relative:text;mso-width-percent:0;mso-height-percent:0;mso-width-relative:page;mso-height-relative:page;v-text-anchor:top" o:gfxdata="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" filled="f" stroked="f">
               <v:textbox inset=".5mm,1.2mm,.5mm,.5mm">
                 <w:txbxContent>
                   <w:p>
@@ -3380,7 +3578,7 @@
             </wp:anchor>
           </w:drawing>
         </mc:Choice>
-        <mc:Fallback xmlns:w16du="http://schemas.microsoft.com/office/word/2023/wordml/word16du">
+        <mc:Fallback>
           <w:pict>
             <v:line w14:anchorId="23DA4A24" id="Straight Connector 19" o:spid="_x0000_s1026" style="position:absolute;flip:y;z-index:251659264;visibility:visible;mso-wrap-style:square;mso-width-percent:0;mso-height-percent:0;mso-wrap-distance-left:9pt;mso-wrap-distance-top:0;mso-wrap-distance-right:9pt;mso-wrap-distance-bottom:0;mso-position-horizontal:absolute;mso-position-horizontal-relative:text;mso-position-vertical:absolute;mso-position-vertical-relative:text;mso-width-percent:0;mso-height-percent:0;mso-width-relative:page;mso-height-relative:page" from="-.1pt,5.2pt" to="520.7pt,5.2pt" o:gfxdata="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" strokecolor="#974706 [1609]" strokeweight="1pt">
               <v:stroke endcap="round"/>
@@ -3605,7 +3803,7 @@
         </mc:Choice>
         <mc:Fallback>
           <w:pict>
-            <v:shape w14:anchorId="0D7D8A2E" id="Text Box 4" o:spid="_x0000_s1027" type="#_x0000_t202" style="position:absolute;margin-left:444.65pt;margin-top:8.35pt;width:70.9pt;height:15.9pt;z-index:251661312;visibility:visible;mso-wrap-style:square;mso-width-percent:0;mso-height-percent:0;mso-wrap-distance-left:9pt;mso-wrap-distance-top:0;mso-wrap-distance-right:9pt;mso-wrap-distance-bottom:0;mso-position-horizontal:absolute;mso-position-horizontal-relative:text;mso-position-vertical:absolute;mso-position-vertical-relative:text;mso-width-percent:0;mso-height-percent:0;mso-width-relative:page;mso-height-relative:page;v-text-anchor:middle" o:gfxdata="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" filled="f" stroked="f" strokeweight=".5pt">
+            <v:shape w14:anchorId="0D7D8A2E" id="Text Box 4" o:spid="_x0000_s1027" type="#_x0000_t202" style="position:absolute;margin-left:444.65pt;margin-top:8.35pt;width:70.9pt;height:15.9pt;z-index:251661312;visibility:visible;mso-wrap-style:square;mso-width-percent:0;mso-height-percent:0;mso-wrap-distance-left:9pt;mso-wrap-distance-top:0;mso-wrap-distance-right:9pt;mso-wrap-distance-bottom:0;mso-position-horizontal:absolute;mso-position-horizontal-relative:text;mso-position-vertical:absolute;mso-position-vertical-relative:text;mso-width-percent:0;mso-height-percent:0;mso-width-relative:page;mso-height-relative:page;v-text-anchor:middle" o:gfxdata="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" filled="f" stroked="f" strokeweight=".5pt">
               <v:textbox inset="0,0,0,0">
                 <w:txbxContent>
                   <w:p>
@@ -3755,7 +3953,7 @@
 </file>
 
 <file path=word/footnotes.xml><?xml version="1.0" encoding="utf-8"?>
-<w:footnotes xmlns:wpc="http://schemas.microsoft.com/office/word/2010/wordprocessingCanvas" xmlns:cx="http://schemas.microsoft.com/office/drawing/2014/chartex" xmlns:cx1="http://schemas.microsoft.com/office/drawing/2015/9/8/chartex" xmlns:cx2="http://schemas.microsoft.com/office/drawing/2015/10/21/chartex" xmlns:cx3="http://schemas.microsoft.com/office/drawing/2016/5/9/chartex" xmlns:cx4="http://schemas.microsoft.com/office/drawing/2016/5/10/chartex" xmlns:cx5="http://schemas.microsoft.com/office/drawing/2016/5/11/chartex" xmlns:cx6="http://schemas.microsoft.com/office/drawing/2016/5/12/chartex" xmlns:cx7="http://schemas.microsoft.com/office/drawing/2016/5/13/chartex" xmlns:cx8="http://schemas.microsoft.com/office/drawing/2016/5/14/chartex" xmlns:mc="http://schemas.openxmlformats.org/markup-compatibility/2006" xmlns:aink="http://schemas.microsoft.com/office/drawing/2016/ink" xmlns:am3d="http://schemas.microsoft.com/office/drawing/2017/model3d" xmlns:o="urn:schemas-microsoft-com:office:office" xmlns:oel="http://schemas.microsoft.com/office/2019/extlst" xmlns:r="http://schemas.openxmlformats.org/officeDocument/2006/relationships" xmlns:m="http://schemas.openxmlformats.org/officeDocument/2006/math" xmlns:v="urn:schemas-microsoft-com:vml" xmlns:wp14="http://schemas.microsoft.com/office/word/2010/wordprocessingDrawing" xmlns:wp="http://schemas.openxmlformats.org/drawingml/2006/wordprocessingDrawing" xmlns:w10="urn:schemas-microsoft-com:office:word" xmlns:w="http://schemas.openxmlformats.org/wordprocessingml/2006/main" xmlns:w14="http://schemas.microsoft.com/office/word/2010/wordml" xmlns:w15="http://schemas.microsoft.com/office/word/2012/wordml" xmlns:w16cex="http://schemas.microsoft.com/office/word/2018/wordml/cex" xmlns:w16cid="http://schemas.microsoft.com/office/word/2016/wordml/cid" xmlns:w16="http://schemas.microsoft.com/office/word/2018/wordml" xmlns:w16sdtdh="http://schemas.microsoft.com/office/word/2020/wordml/sdtdatahash" xmlns:w16se="http://schemas.microsoft.com/office/word/2015/wordml/symex" xmlns:wpg="http://schemas.microsoft.com/office/word/2010/wordprocessingGroup" xmlns:wpi="http://schemas.microsoft.com/office/word/2010/wordprocessingInk" xmlns:wne="http://schemas.microsoft.com/office/word/2006/wordml" xmlns:wps="http://schemas.microsoft.com/office/word/2010/wordprocessingShape" mc:Ignorable="w14 w15 w16se w16cid w16 w16cex w16sdtdh wp14">
+<w:footnotes xmlns:wpc="http://schemas.microsoft.com/office/word/2010/wordprocessingCanvas" xmlns:cx="http://schemas.microsoft.com/office/drawing/2014/chartex" xmlns:cx1="http://schemas.microsoft.com/office/drawing/2015/9/8/chartex" xmlns:cx2="http://schemas.microsoft.com/office/drawing/2015/10/21/chartex" xmlns:cx3="http://schemas.microsoft.com/office/drawing/2016/5/9/chartex" xmlns:cx4="http://schemas.microsoft.com/office/drawing/2016/5/10/chartex" xmlns:cx5="http://schemas.microsoft.com/office/drawing/2016/5/11/chartex" xmlns:cx6="http://schemas.microsoft.com/office/drawing/2016/5/12/chartex" xmlns:cx7="http://schemas.microsoft.com/office/drawing/2016/5/13/chartex" xmlns:cx8="http://schemas.microsoft.com/office/drawing/2016/5/14/chartex" xmlns:mc="http://schemas.openxmlformats.org/markup-compatibility/2006" xmlns:aink="http://schemas.microsoft.com/office/drawing/2016/ink" xmlns:am3d="http://schemas.microsoft.com/office/drawing/2017/model3d" xmlns:o="urn:schemas-microsoft-com:office:office" xmlns:oel="http://schemas.microsoft.com/office/2019/extlst" xmlns:r="http://schemas.openxmlformats.org/officeDocument/2006/relationships" xmlns:m="http://schemas.openxmlformats.org/officeDocument/2006/math" xmlns:v="urn:schemas-microsoft-com:vml" xmlns:wp14="http://schemas.microsoft.com/office/word/2010/wordprocessingDrawing" xmlns:wp="http://schemas.openxmlformats.org/drawingml/2006/wordprocessingDrawing" xmlns:w10="urn:schemas-microsoft-com:office:word" xmlns:w="http://schemas.openxmlformats.org/wordprocessingml/2006/main" xmlns:w14="http://schemas.microsoft.com/office/word/2010/wordml" xmlns:w15="http://schemas.microsoft.com/office/word/2012/wordml" xmlns:w16cex="http://schemas.microsoft.com/office/word/2018/wordml/cex" xmlns:w16cid="http://schemas.microsoft.com/office/word/2016/wordml/cid" xmlns:w16="http://schemas.microsoft.com/office/word/2018/wordml" xmlns:w16du="http://schemas.microsoft.com/office/word/2023/wordml/word16du" xmlns:w16sdtdh="http://schemas.microsoft.com/office/word/2020/wordml/sdtdatahash" xmlns:w16se="http://schemas.microsoft.com/office/word/2015/wordml/symex" xmlns:wpg="http://schemas.microsoft.com/office/word/2010/wordprocessingGroup" xmlns:wpi="http://schemas.microsoft.com/office/word/2010/wordprocessingInk" xmlns:wne="http://schemas.microsoft.com/office/word/2006/wordml" xmlns:wps="http://schemas.microsoft.com/office/word/2010/wordprocessingShape" mc:Ignorable="w14 w15 w16se w16cid w16 w16cex w16sdtdh w16du wp14">
   <w:footnote w:type="separator" w:id="-1">
     <w:p>
       <w:pPr>
@@ -3780,7 +3978,7 @@
 </file>
 
 <file path=word/header1.xml><?xml version="1.0" encoding="utf-8"?>
-<w:hdr xmlns:wpc="http://schemas.microsoft.com/office/word/2010/wordprocessingCanvas" xmlns:cx="http://schemas.microsoft.com/office/drawing/2014/chartex" xmlns:cx1="http://schemas.microsoft.com/office/drawing/2015/9/8/chartex" xmlns:cx2="http://schemas.microsoft.com/office/drawing/2015/10/21/chartex" xmlns:cx3="http://schemas.microsoft.com/office/drawing/2016/5/9/chartex" xmlns:cx4="http://schemas.microsoft.com/office/drawing/2016/5/10/chartex" xmlns:cx5="http://schemas.microsoft.com/office/drawing/2016/5/11/chartex" xmlns:cx6="http://schemas.microsoft.com/office/drawing/2016/5/12/chartex" xmlns:cx7="http://schemas.microsoft.com/office/drawing/2016/5/13/chartex" xmlns:cx8="http://schemas.microsoft.com/office/drawing/2016/5/14/chartex" xmlns:mc="http://schemas.openxmlformats.org/markup-compatibility/2006" xmlns:aink="http://schemas.microsoft.com/office/drawing/2016/ink" xmlns:am3d="http://schemas.microsoft.com/office/drawing/2017/model3d" xmlns:o="urn:schemas-microsoft-com:office:office" xmlns:oel="http://schemas.microsoft.com/office/2019/extlst" xmlns:r="http://schemas.openxmlformats.org/officeDocument/2006/relationships" xmlns:m="http://schemas.openxmlformats.org/officeDocument/2006/math" xmlns:v="urn:schemas-microsoft-com:vml" xmlns:wp14="http://schemas.microsoft.com/office/word/2010/wordprocessingDrawing" xmlns:wp="http://schemas.openxmlformats.org/drawingml/2006/wordprocessingDrawing" xmlns:w10="urn:schemas-microsoft-com:office:word" xmlns:w="http://schemas.openxmlformats.org/wordprocessingml/2006/main" xmlns:w14="http://schemas.microsoft.com/office/word/2010/wordml" xmlns:w15="http://schemas.microsoft.com/office/word/2012/wordml" xmlns:w16cex="http://schemas.microsoft.com/office/word/2018/wordml/cex" xmlns:w16cid="http://schemas.microsoft.com/office/word/2016/wordml/cid" xmlns:w16="http://schemas.microsoft.com/office/word/2018/wordml" xmlns:w16sdtdh="http://schemas.microsoft.com/office/word/2020/wordml/sdtdatahash" xmlns:w16se="http://schemas.microsoft.com/office/word/2015/wordml/symex" xmlns:wpg="http://schemas.microsoft.com/office/word/2010/wordprocessingGroup" xmlns:wpi="http://schemas.microsoft.com/office/word/2010/wordprocessingInk" xmlns:wne="http://schemas.microsoft.com/office/word/2006/wordml" xmlns:wps="http://schemas.microsoft.com/office/word/2010/wordprocessingShape" mc:Ignorable="w14 w15 w16se w16cid w16 w16cex w16sdtdh wp14">
+<w:hdr xmlns:wpc="http://schemas.microsoft.com/office/word/2010/wordprocessingCanvas" xmlns:cx="http://schemas.microsoft.com/office/drawing/2014/chartex" xmlns:cx1="http://schemas.microsoft.com/office/drawing/2015/9/8/chartex" xmlns:cx2="http://schemas.microsoft.com/office/drawing/2015/10/21/chartex" xmlns:cx3="http://schemas.microsoft.com/office/drawing/2016/5/9/chartex" xmlns:cx4="http://schemas.microsoft.com/office/drawing/2016/5/10/chartex" xmlns:cx5="http://schemas.microsoft.com/office/drawing/2016/5/11/chartex" xmlns:cx6="http://schemas.microsoft.com/office/drawing/2016/5/12/chartex" xmlns:cx7="http://schemas.microsoft.com/office/drawing/2016/5/13/chartex" xmlns:cx8="http://schemas.microsoft.com/office/drawing/2016/5/14/chartex" xmlns:mc="http://schemas.openxmlformats.org/markup-compatibility/2006" xmlns:aink="http://schemas.microsoft.com/office/drawing/2016/ink" xmlns:am3d="http://schemas.microsoft.com/office/drawing/2017/model3d" xmlns:o="urn:schemas-microsoft-com:office:office" xmlns:oel="http://schemas.microsoft.com/office/2019/extlst" xmlns:r="http://schemas.openxmlformats.org/officeDocument/2006/relationships" xmlns:m="http://schemas.openxmlformats.org/officeDocument/2006/math" xmlns:v="urn:schemas-microsoft-com:vml" xmlns:wp14="http://schemas.microsoft.com/office/word/2010/wordprocessingDrawing" xmlns:wp="http://schemas.openxmlformats.org/drawingml/2006/wordprocessingDrawing" xmlns:w10="urn:schemas-microsoft-com:office:word" xmlns:w="http://schemas.openxmlformats.org/wordprocessingml/2006/main" xmlns:w14="http://schemas.microsoft.com/office/word/2010/wordml" xmlns:w15="http://schemas.microsoft.com/office/word/2012/wordml" xmlns:w16cex="http://schemas.microsoft.com/office/word/2018/wordml/cex" xmlns:w16cid="http://schemas.microsoft.com/office/word/2016/wordml/cid" xmlns:w16="http://schemas.microsoft.com/office/word/2018/wordml" xmlns:w16du="http://schemas.microsoft.com/office/word/2023/wordml/word16du" xmlns:w16sdtdh="http://schemas.microsoft.com/office/word/2020/wordml/sdtdatahash" xmlns:w16se="http://schemas.microsoft.com/office/word/2015/wordml/symex" xmlns:wpg="http://schemas.microsoft.com/office/word/2010/wordprocessingGroup" xmlns:wpi="http://schemas.microsoft.com/office/word/2010/wordprocessingInk" xmlns:wne="http://schemas.microsoft.com/office/word/2006/wordml" xmlns:wps="http://schemas.microsoft.com/office/word/2010/wordprocessingShape" mc:Ignorable="w14 w15 w16se w16cid w16 w16cex w16sdtdh w16du wp14">
   <w:p>
     <w:pPr>
       <w:pStyle w:val="Header"/>
@@ -3791,7 +3989,7 @@
 </file>
 
 <file path=word/numbering.xml><?xml version="1.0" encoding="utf-8"?>
-<w:numbering xmlns:wpc="http://schemas.microsoft.com/office/word/2010/wordprocessingCanvas" xmlns:cx="http://schemas.microsoft.com/office/drawing/2014/chartex" xmlns:cx1="http://schemas.microsoft.com/office/drawing/2015/9/8/chartex" xmlns:cx2="http://schemas.microsoft.com/office/drawing/2015/10/21/chartex" xmlns:cx3="http://schemas.microsoft.com/office/drawing/2016/5/9/chartex" xmlns:cx4="http://schemas.microsoft.com/office/drawing/2016/5/10/chartex" xmlns:cx5="http://schemas.microsoft.com/office/drawing/2016/5/11/chartex" xmlns:cx6="http://schemas.microsoft.com/office/drawing/2016/5/12/chartex" xmlns:cx7="http://schemas.microsoft.com/office/drawing/2016/5/13/chartex" xmlns:cx8="http://schemas.microsoft.com/office/drawing/2016/5/14/chartex" xmlns:mc="http://schemas.openxmlformats.org/markup-compatibility/2006" xmlns:aink="http://schemas.microsoft.com/office/drawing/2016/ink" xmlns:am3d="http://schemas.microsoft.com/office/drawing/2017/model3d" xmlns:o="urn:schemas-microsoft-com:office:office" xmlns:oel="http://schemas.microsoft.com/office/2019/extlst" xmlns:r="http://schemas.openxmlformats.org/officeDocument/2006/relationships" xmlns:m="http://schemas.openxmlformats.org/officeDocument/2006/math" xmlns:v="urn:schemas-microsoft-com:vml" xmlns:wp14="http://schemas.microsoft.com/office/word/2010/wordprocessingDrawing" xmlns:wp="http://schemas.openxmlformats.org/drawingml/2006/wordprocessingDrawing" xmlns:w10="urn:schemas-microsoft-com:office:word" xmlns:w="http://schemas.openxmlformats.org/wordprocessingml/2006/main" xmlns:w14="http://schemas.microsoft.com/office/word/2010/wordml" xmlns:w15="http://schemas.microsoft.com/office/word/2012/wordml" xmlns:w16cex="http://schemas.microsoft.com/office/word/2018/wordml/cex" xmlns:w16cid="http://schemas.microsoft.com/office/word/2016/wordml/cid" xmlns:w16="http://schemas.microsoft.com/office/word/2018/wordml" xmlns:w16sdtdh="http://schemas.microsoft.com/office/word/2020/wordml/sdtdatahash" xmlns:w16se="http://schemas.microsoft.com/office/word/2015/wordml/symex" xmlns:wpg="http://schemas.microsoft.com/office/word/2010/wordprocessingGroup" xmlns:wpi="http://schemas.microsoft.com/office/word/2010/wordprocessingInk" xmlns:wne="http://schemas.microsoft.com/office/word/2006/wordml" xmlns:wps="http://schemas.microsoft.com/office/word/2010/wordprocessingShape" mc:Ignorable="w14 w15 w16se w16cid w16 w16cex w16sdtdh wp14">
+<w:numbering xmlns:wpc="http://schemas.microsoft.com/office/word/2010/wordprocessingCanvas" xmlns:cx="http://schemas.microsoft.com/office/drawing/2014/chartex" xmlns:cx1="http://schemas.microsoft.com/office/drawing/2015/9/8/chartex" xmlns:cx2="http://schemas.microsoft.com/office/drawing/2015/10/21/chartex" xmlns:cx3="http://schemas.microsoft.com/office/drawing/2016/5/9/chartex" xmlns:cx4="http://schemas.microsoft.com/office/drawing/2016/5/10/chartex" xmlns:cx5="http://schemas.microsoft.com/office/drawing/2016/5/11/chartex" xmlns:cx6="http://schemas.microsoft.com/office/drawing/2016/5/12/chartex" xmlns:cx7="http://schemas.microsoft.com/office/drawing/2016/5/13/chartex" xmlns:cx8="http://schemas.microsoft.com/office/drawing/2016/5/14/chartex" xmlns:mc="http://schemas.openxmlformats.org/markup-compatibility/2006" xmlns:aink="http://schemas.microsoft.com/office/drawing/2016/ink" xmlns:am3d="http://schemas.microsoft.com/office/drawing/2017/model3d" xmlns:o="urn:schemas-microsoft-com:office:office" xmlns:oel="http://schemas.microsoft.com/office/2019/extlst" xmlns:r="http://schemas.openxmlformats.org/officeDocument/2006/relationships" xmlns:m="http://schemas.openxmlformats.org/officeDocument/2006/math" xmlns:v="urn:schemas-microsoft-com:vml" xmlns:wp14="http://schemas.microsoft.com/office/word/2010/wordprocessingDrawing" xmlns:wp="http://schemas.openxmlformats.org/drawingml/2006/wordprocessingDrawing" xmlns:w10="urn:schemas-microsoft-com:office:word" xmlns:w="http://schemas.openxmlformats.org/wordprocessingml/2006/main" xmlns:w14="http://schemas.microsoft.com/office/word/2010/wordml" xmlns:w15="http://schemas.microsoft.com/office/word/2012/wordml" xmlns:w16cex="http://schemas.microsoft.com/office/word/2018/wordml/cex" xmlns:w16cid="http://schemas.microsoft.com/office/word/2016/wordml/cid" xmlns:w16="http://schemas.microsoft.com/office/word/2018/wordml" xmlns:w16du="http://schemas.microsoft.com/office/word/2023/wordml/word16du" xmlns:w16sdtdh="http://schemas.microsoft.com/office/word/2020/wordml/sdtdatahash" xmlns:w16se="http://schemas.microsoft.com/office/word/2015/wordml/symex" xmlns:wpg="http://schemas.microsoft.com/office/word/2010/wordprocessingGroup" xmlns:wpi="http://schemas.microsoft.com/office/word/2010/wordprocessingInk" xmlns:wne="http://schemas.microsoft.com/office/word/2006/wordml" xmlns:wps="http://schemas.microsoft.com/office/word/2010/wordprocessingShape" mc:Ignorable="w14 w15 w16se w16cid w16 w16cex w16sdtdh w16du wp14">
   <w:abstractNum w:abstractNumId="0" w15:restartNumberingAfterBreak="0">
     <w:nsid w:val="043D512A"/>
     <w:multiLevelType w:val="hybridMultilevel"/>
@@ -5379,7 +5577,7 @@
 </file>
 
 <file path=word/styles.xml><?xml version="1.0" encoding="utf-8"?>
-<w:styles xmlns:mc="http://schemas.openxmlformats.org/markup-compatibility/2006" xmlns:r="http://schemas.openxmlformats.org/officeDocument/2006/relationships" xmlns:w="http://schemas.openxmlformats.org/wordprocessingml/2006/main" xmlns:w14="http://schemas.microsoft.com/office/word/2010/wordml" xmlns:w15="http://schemas.microsoft.com/office/word/2012/wordml" xmlns:w16cex="http://schemas.microsoft.com/office/word/2018/wordml/cex" xmlns:w16cid="http://schemas.microsoft.com/office/word/2016/wordml/cid" xmlns:w16="http://schemas.microsoft.com/office/word/2018/wordml" xmlns:w16sdtdh="http://schemas.microsoft.com/office/word/2020/wordml/sdtdatahash" xmlns:w16se="http://schemas.microsoft.com/office/word/2015/wordml/symex" mc:Ignorable="w14 w15 w16se w16cid w16 w16cex w16sdtdh">
+<w:styles xmlns:mc="http://schemas.openxmlformats.org/markup-compatibility/2006" xmlns:r="http://schemas.openxmlformats.org/officeDocument/2006/relationships" xmlns:w="http://schemas.openxmlformats.org/wordprocessingml/2006/main" xmlns:w14="http://schemas.microsoft.com/office/word/2010/wordml" xmlns:w15="http://schemas.microsoft.com/office/word/2012/wordml" xmlns:w16cex="http://schemas.microsoft.com/office/word/2018/wordml/cex" xmlns:w16cid="http://schemas.microsoft.com/office/word/2016/wordml/cid" xmlns:w16="http://schemas.microsoft.com/office/word/2018/wordml" xmlns:w16du="http://schemas.microsoft.com/office/word/2023/wordml/word16du" xmlns:w16sdtdh="http://schemas.microsoft.com/office/word/2020/wordml/sdtdatahash" xmlns:w16se="http://schemas.microsoft.com/office/word/2015/wordml/symex" mc:Ignorable="w14 w15 w16se w16cid w16 w16cex w16sdtdh w16du">
   <w:docDefaults>
     <w:rPrDefault>
       <w:rPr>

</xml_diff>